<commit_message>
Standard letters are the company's Word letters
The built-in salary, experience, NOC and employment letters are now the
company's own Word files (embedded from doc-files/templates), so issued
letters match the .docx exactly. Installed copies are upgraded at startup:
untouched text certificates become the Word letters, missing ones are added.
Adds the letter signatory to company settings and an OTHER pay component.

Co-Authored-By: Claude Opus 5.5 <noreply@anthropic.com>
</commit_message>
<xml_diff>
--- a/doc-files/templates/Certificate of employment.docx
+++ b/doc-files/templates/Certificate of employment.docx
@@ -148,7 +148,7 @@
           <w:rFonts w:ascii="Bookman Old Style" w:hAnsi="Bookman Old Style"/>
           <w:b/>
         </w:rPr>
-        <w:t>THESOFTKING LIMITED</w:t>
+        <w:t>{Company.Name:upper}</w:t>
       </w:r>
     </w:p>
     <w:p>
@@ -292,7 +292,7 @@
         <w:rPr>
           <w:rFonts w:ascii="Times New Roman" w:hAnsi="Times New Roman" w:cs="Times New Roman"/>
         </w:rPr>
-        <w:t xml:space="preserve"> has been employed as a permanent staff member at THESOFTKING Limited since {Employee.JoinDate:MMMM d, yyyy}. {Employee.HeShe} currently holds the position of {Employee.Designation} and is responsible for the design, development, and maintenance of websites and web applications.</w:t>
+        <w:t xml:space="preserve"> has been employed as a permanent staff member at {Company.Name} since {Employee.JoinDate:MMMM d, yyyy}. {Employee.HeShe} currently holds the position of {Employee.Designation} and is responsible for the design, development, and maintenance of websites and web applications.</w:t>
       </w:r>
     </w:p>
     <w:p>
@@ -414,7 +414,7 @@
         <w:rPr>
           <w:rFonts w:ascii="Times New Roman" w:hAnsi="Times New Roman" w:cs="Times New Roman"/>
         </w:rPr>
-        <w:t xml:space="preserve"> is an active and ongoing employee of THESOFTKING Limited.</w:t>
+        <w:t xml:space="preserve"> is an active and ongoing employee of {Company.Name}.</w:t>
       </w:r>
     </w:p>
     <w:p>
@@ -484,42 +484,42 @@
         <w:rPr>
           <w:rFonts w:ascii="Bookman Old Style" w:hAnsi="Bookman Old Style"/>
         </w:rPr>
-        <w:t xml:space="preserve">MD </w:t>
+        <w:t xml:space="preserve">{Company.SignatoryName}</w:t>
       </w:r>
       <w:proofErr w:type="spellStart"/>
       <w:r>
         <w:rPr>
           <w:rFonts w:ascii="Bookman Old Style" w:hAnsi="Bookman Old Style"/>
         </w:rPr>
-        <w:t>Hasibur</w:t>
+        <w:t/>
       </w:r>
       <w:proofErr w:type="spellEnd"/>
       <w:r>
         <w:rPr>
           <w:rFonts w:ascii="Bookman Old Style" w:hAnsi="Bookman Old Style"/>
         </w:rPr>
-        <w:t xml:space="preserve"> </w:t>
+        <w:t xml:space="preserve"/>
       </w:r>
       <w:proofErr w:type="spellStart"/>
       <w:r>
         <w:rPr>
           <w:rFonts w:ascii="Bookman Old Style" w:hAnsi="Bookman Old Style"/>
         </w:rPr>
-        <w:t>Rahman</w:t>
+        <w:t/>
       </w:r>
       <w:proofErr w:type="spellEnd"/>
       <w:r>
         <w:rPr>
           <w:rFonts w:ascii="Bookman Old Style" w:hAnsi="Bookman Old Style"/>
         </w:rPr>
-        <w:t xml:space="preserve"> </w:t>
+        <w:t xml:space="preserve"/>
       </w:r>
       <w:proofErr w:type="spellStart"/>
       <w:r>
         <w:rPr>
           <w:rFonts w:ascii="Bookman Old Style" w:hAnsi="Bookman Old Style"/>
         </w:rPr>
-        <w:t>Hasan</w:t>
+        <w:t/>
       </w:r>
       <w:proofErr w:type="spellEnd"/>
     </w:p>
@@ -535,21 +535,21 @@
         <w:rPr>
           <w:rFonts w:ascii="Bookman Old Style" w:hAnsi="Bookman Old Style"/>
         </w:rPr>
-        <w:t xml:space="preserve">Head </w:t>
+        <w:t xml:space="preserve">{Company.SignatoryTitle}</w:t>
       </w:r>
       <w:proofErr w:type="gramStart"/>
       <w:r>
         <w:rPr>
           <w:rFonts w:ascii="Bookman Old Style" w:hAnsi="Bookman Old Style"/>
         </w:rPr>
-        <w:t>Of</w:t>
+        <w:t/>
       </w:r>
       <w:proofErr w:type="gramEnd"/>
       <w:r>
         <w:rPr>
           <w:rFonts w:ascii="Bookman Old Style" w:hAnsi="Bookman Old Style"/>
         </w:rPr>
-        <w:t xml:space="preserve"> Operations</w:t>
+        <w:t xml:space="preserve"/>
       </w:r>
     </w:p>
     <w:p>
@@ -566,7 +566,7 @@
           <w:rFonts w:ascii="Bookman Old Style" w:hAnsi="Bookman Old Style"/>
           <w:b/>
         </w:rPr>
-        <w:t>THESOFTKING Limited</w:t>
+        <w:t>{Company.Name}</w:t>
       </w:r>
     </w:p>
     <w:p/>

</xml_diff>